<commit_message>
Drafting report and comparative analysis
Worked further on the sample report drafting. Added a comparative system study analysis to documentation preparation.
</commit_message>
<xml_diff>
--- a/Documentation/Preparation/System Requirement Analysis/Finalized_Interview&Survey_questions.docx
+++ b/Documentation/Preparation/System Requirement Analysis/Finalized_Interview&Survey_questions.docx
@@ -81,16 +81,14 @@
         </w:rPr>
         <w:t xml:space="preserve">The </w:t>
       </w:r>
-      <w:proofErr w:type="spellStart"/>
-      <w:r>
-        <w:rPr>
-          <w:rFonts w:ascii="Times New Roman" w:eastAsia="Times New Roman" w:hAnsi="Times New Roman" w:cs="Times New Roman"/>
-          <w:sz w:val="24"/>
-          <w:szCs w:val="24"/>
-        </w:rPr>
-        <w:t>difficulites</w:t>
-      </w:r>
-      <w:proofErr w:type="spellEnd"/>
+      <w:r>
+        <w:rPr>
+          <w:rFonts w:ascii="Times New Roman" w:eastAsia="Times New Roman" w:hAnsi="Times New Roman" w:cs="Times New Roman"/>
+          <w:sz w:val="24"/>
+          <w:szCs w:val="24"/>
+        </w:rPr>
+        <w:t>difficulties</w:t>
+      </w:r>
       <w:r>
         <w:rPr>
           <w:rFonts w:ascii="Times New Roman" w:eastAsia="Times New Roman" w:hAnsi="Times New Roman" w:cs="Times New Roman"/>

</xml_diff>